<commit_message>
Link CVs and clarify academic references without numbering
</commit_message>
<xml_diff>
--- a/Joao_Jose_CV_20260823_005.docx
+++ b/Joao_Jose_CV_20260823_005.docx
@@ -102,6 +102,23 @@
                 <w:t>linkedin.com/in/joaojose</w:t>
               </w:r>
             </w:hyperlink>
+            <w:r>
+              <w:rPr>
+                <w:color w:val="595959"/>
+                <w:sz w:val="17"/>
+              </w:rPr>
+              <w:t xml:space="preserve">  |  </w:t>
+            </w:r>
+            <w:hyperlink r:id="rId11">
+              <w:r>
+                <w:rPr>
+                  <w:color w:val="206091"/>
+                  <w:sz w:val="17"/>
+                  <w:u w:val="single"/>
+                </w:rPr>
+                <w:t>Academic CV</w:t>
+              </w:r>
+            </w:hyperlink>
           </w:p>
         </w:tc>
         <w:tc>
@@ -140,7 +157,7 @@
                           <pic:cNvPicPr/>
                         </pic:nvPicPr>
                         <pic:blipFill>
-                          <a:blip r:embed="rId11"/>
+                          <a:blip r:embed="rId12"/>
                           <a:stretch>
                             <a:fillRect/>
                           </a:stretch>
@@ -914,12 +931,12 @@
       </w:r>
     </w:p>
     <w:sectPr>
-      <w:headerReference w:type="even" r:id="rId12"/>
-      <w:headerReference w:type="default" r:id="rId13"/>
-      <w:footerReference w:type="even" r:id="rId14"/>
-      <w:footerReference w:type="default" r:id="rId15"/>
-      <w:headerReference w:type="first" r:id="rId16"/>
-      <w:footerReference w:type="first" r:id="rId17"/>
+      <w:headerReference w:type="even" r:id="rId13"/>
+      <w:headerReference w:type="default" r:id="rId14"/>
+      <w:footerReference w:type="even" r:id="rId15"/>
+      <w:footerReference w:type="default" r:id="rId16"/>
+      <w:headerReference w:type="first" r:id="rId17"/>
+      <w:footerReference w:type="first" r:id="rId18"/>
       <w:pgSz w:w="11905" w:h="16838"/>
       <w:pgMar w:top="893" w:right="1037" w:bottom="835" w:left="1037" w:header="403" w:footer="432" w:gutter="0"/>
       <w:cols w:space="720"/>
@@ -955,12 +972,10 @@
 </file>
 
 <file path=word/footer1.xml><?xml version="1.0" encoding="utf-8"?>
-<w:ftr xmlns:w="http://schemas.openxmlformats.org/wordprocessingml/2006/main">
+<w:ftr xmlns:wpc="http://schemas.microsoft.com/office/word/2010/wordprocessingCanvas" xmlns:cx="http://schemas.microsoft.com/office/drawing/2014/chartex" xmlns:cx1="http://schemas.microsoft.com/office/drawing/2015/9/8/chartex" xmlns:cx2="http://schemas.microsoft.com/office/drawing/2015/10/21/chartex" xmlns:cx3="http://schemas.microsoft.com/office/drawing/2016/5/9/chartex" xmlns:cx4="http://schemas.microsoft.com/office/drawing/2016/5/10/chartex" xmlns:cx5="http://schemas.microsoft.com/office/drawing/2016/5/11/chartex" xmlns:cx6="http://schemas.microsoft.com/office/drawing/2016/5/12/chartex" xmlns:cx7="http://schemas.microsoft.com/office/drawing/2016/5/13/chartex" xmlns:cx8="http://schemas.microsoft.com/office/drawing/2016/5/14/chartex" xmlns:mc="http://schemas.openxmlformats.org/markup-compatibility/2006" xmlns:aink="http://schemas.microsoft.com/office/drawing/2016/ink" xmlns:am3d="http://schemas.microsoft.com/office/drawing/2017/model3d" xmlns:o="urn:schemas-microsoft-com:office:office" xmlns:oel="http://schemas.microsoft.com/office/2019/extlst" xmlns:r="http://schemas.openxmlformats.org/officeDocument/2006/relationships" xmlns:m="http://schemas.openxmlformats.org/officeDocument/2006/math" xmlns:v="urn:schemas-microsoft-com:vml" xmlns:wp14="http://schemas.microsoft.com/office/word/2010/wordprocessingDrawing" xmlns:wp="http://schemas.openxmlformats.org/drawingml/2006/wordprocessingDrawing" xmlns:w10="urn:schemas-microsoft-com:office:word" xmlns:w="http://schemas.openxmlformats.org/wordprocessingml/2006/main" xmlns:w14="http://schemas.microsoft.com/office/word/2010/wordml" xmlns:w15="http://schemas.microsoft.com/office/word/2012/wordml" xmlns:w16cex="http://schemas.microsoft.com/office/word/2018/wordml/cex" xmlns:w16cid="http://schemas.microsoft.com/office/word/2016/wordml/cid" xmlns:w16="http://schemas.microsoft.com/office/word/2018/wordml" xmlns:w16du="http://schemas.microsoft.com/office/word/2023/wordml/word16du" xmlns:w16sdtdh="http://schemas.microsoft.com/office/word/2020/wordml/sdtdatahash" xmlns:w16sdtfl="http://schemas.microsoft.com/office/word/2024/wordml/sdtformatlock" xmlns:w16se="http://schemas.microsoft.com/office/word/2015/wordml/symex" xmlns:wpg="http://schemas.microsoft.com/office/word/2010/wordprocessingGroup" xmlns:wpi="http://schemas.microsoft.com/office/word/2010/wordprocessingInk" xmlns:wne="http://schemas.microsoft.com/office/word/2006/wordml" xmlns:wps="http://schemas.microsoft.com/office/word/2010/wordprocessingShape" mc:Ignorable="w14 w15 w16se w16cid w16 w16cex w16sdtdh w16sdtfl w16du wp14">
   <w:tbl>
     <w:tblPr>
       <w:tblW w:w="9831" w:type="dxa"/>
-      <w:jc w:val="left"/>
-      <w:tblInd w:w="0" w:type="dxa"/>
       <w:tblBorders>
         <w:top w:val="nil"/>
         <w:left w:val="nil"/>
@@ -971,11 +986,10 @@
       </w:tblBorders>
       <w:tblLayout w:type="fixed"/>
       <w:tblCellMar>
-        <w:top w:w="0" w:type="dxa"/>
         <w:left w:w="0" w:type="dxa"/>
-        <w:bottom w:w="0" w:type="dxa"/>
         <w:right w:w="0" w:type="dxa"/>
       </w:tblCellMar>
+      <w:tblLook w:val="04A0" w:firstRow="1" w:lastRow="0" w:firstColumn="1" w:lastColumn="0" w:noHBand="0" w:noVBand="1"/>
     </w:tblPr>
     <w:tblGrid>
       <w:gridCol w:w="3000"/>
@@ -996,17 +1010,15 @@
         <w:p>
           <w:pPr>
             <w:pStyle w:val="Footer"/>
-            <w:spacing w:before="0" w:after="0"/>
-            <w:jc w:val="left"/>
           </w:pPr>
           <w:r>
             <w:rPr>
-              <w:rFonts w:ascii="Arial" w:hAnsi="Arial" w:eastAsia="Arial" w:cs="Arial"/>
+              <w:rFonts w:eastAsia="Arial" w:cs="Arial"/>
               <w:color w:val="AAAAAA"/>
               <w:sz w:val="16"/>
               <w:szCs w:val="16"/>
             </w:rPr>
-            <w:t xml:space="preserve">CV ID 20260823_005</w:t>
+            <w:t>CV ID 20260823_005</w:t>
           </w:r>
         </w:p>
       </w:tc>
@@ -1024,12 +1036,11 @@
         <w:p>
           <w:pPr>
             <w:pStyle w:val="Footer"/>
-            <w:spacing w:before="0" w:after="0"/>
             <w:jc w:val="right"/>
           </w:pPr>
           <w:r>
             <w:rPr>
-              <w:rFonts w:ascii="Arial" w:hAnsi="Arial" w:eastAsia="Arial" w:cs="Arial"/>
+              <w:rFonts w:eastAsia="Arial" w:cs="Arial"/>
               <w:color w:val="AAAAAA"/>
               <w:sz w:val="16"/>
               <w:szCs w:val="16"/>
@@ -1038,16 +1049,16 @@
           </w:r>
           <w:r>
             <w:rPr>
-              <w:rFonts w:ascii="Arial" w:hAnsi="Arial" w:eastAsia="Arial" w:cs="Arial"/>
+              <w:rFonts w:eastAsia="Arial" w:cs="Arial"/>
               <w:color w:val="AAAAAA"/>
               <w:sz w:val="16"/>
               <w:szCs w:val="16"/>
             </w:rPr>
-            <w:fldChar w:fldCharType="begin" w:dirty="true"/>
+            <w:fldChar w:fldCharType="begin"/>
           </w:r>
           <w:r>
             <w:rPr>
-              <w:rFonts w:ascii="Arial" w:hAnsi="Arial" w:eastAsia="Arial" w:cs="Arial"/>
+              <w:rFonts w:eastAsia="Arial" w:cs="Arial"/>
               <w:color w:val="AAAAAA"/>
               <w:sz w:val="16"/>
               <w:szCs w:val="16"/>
@@ -1056,7 +1067,7 @@
           </w:r>
           <w:r>
             <w:rPr>
-              <w:rFonts w:ascii="Arial" w:hAnsi="Arial" w:eastAsia="Arial" w:cs="Arial"/>
+              <w:rFonts w:eastAsia="Arial" w:cs="Arial"/>
               <w:color w:val="AAAAAA"/>
               <w:sz w:val="16"/>
               <w:szCs w:val="16"/>
@@ -1065,7 +1076,7 @@
           </w:r>
           <w:r>
             <w:rPr>
-              <w:rFonts w:ascii="Arial" w:hAnsi="Arial" w:eastAsia="Arial" w:cs="Arial"/>
+              <w:rFonts w:eastAsia="Arial" w:cs="Arial"/>
               <w:color w:val="AAAAAA"/>
               <w:sz w:val="16"/>
               <w:szCs w:val="16"/>
@@ -1074,7 +1085,7 @@
           </w:r>
           <w:r>
             <w:rPr>
-              <w:rFonts w:ascii="Arial" w:hAnsi="Arial" w:eastAsia="Arial" w:cs="Arial"/>
+              <w:rFonts w:eastAsia="Arial" w:cs="Arial"/>
               <w:color w:val="AAAAAA"/>
               <w:sz w:val="16"/>
               <w:szCs w:val="16"/>
@@ -1083,25 +1094,25 @@
           </w:r>
           <w:r>
             <w:rPr>
-              <w:rFonts w:ascii="Arial" w:hAnsi="Arial" w:eastAsia="Arial" w:cs="Arial"/>
+              <w:rFonts w:eastAsia="Arial" w:cs="Arial"/>
               <w:color w:val="AAAAAA"/>
               <w:sz w:val="16"/>
               <w:szCs w:val="16"/>
             </w:rPr>
-            <w:t xml:space="preserve">/</w:t>
+            <w:t>/</w:t>
           </w:r>
           <w:r>
             <w:rPr>
-              <w:rFonts w:ascii="Arial" w:hAnsi="Arial" w:eastAsia="Arial" w:cs="Arial"/>
+              <w:rFonts w:eastAsia="Arial" w:cs="Arial"/>
               <w:color w:val="AAAAAA"/>
               <w:sz w:val="16"/>
               <w:szCs w:val="16"/>
             </w:rPr>
-            <w:fldChar w:fldCharType="begin" w:dirty="true"/>
+            <w:fldChar w:fldCharType="begin"/>
           </w:r>
           <w:r>
             <w:rPr>
-              <w:rFonts w:ascii="Arial" w:hAnsi="Arial" w:eastAsia="Arial" w:cs="Arial"/>
+              <w:rFonts w:eastAsia="Arial" w:cs="Arial"/>
               <w:color w:val="AAAAAA"/>
               <w:sz w:val="16"/>
               <w:szCs w:val="16"/>
@@ -1110,7 +1121,7 @@
           </w:r>
           <w:r>
             <w:rPr>
-              <w:rFonts w:ascii="Arial" w:hAnsi="Arial" w:eastAsia="Arial" w:cs="Arial"/>
+              <w:rFonts w:eastAsia="Arial" w:cs="Arial"/>
               <w:color w:val="AAAAAA"/>
               <w:sz w:val="16"/>
               <w:szCs w:val="16"/>
@@ -1119,7 +1130,7 @@
           </w:r>
           <w:r>
             <w:rPr>
-              <w:rFonts w:ascii="Arial" w:hAnsi="Arial" w:eastAsia="Arial" w:cs="Arial"/>
+              <w:rFonts w:eastAsia="Arial" w:cs="Arial"/>
               <w:color w:val="AAAAAA"/>
               <w:sz w:val="16"/>
               <w:szCs w:val="16"/>
@@ -1128,7 +1139,7 @@
           </w:r>
           <w:r>
             <w:rPr>
-              <w:rFonts w:ascii="Arial" w:hAnsi="Arial" w:eastAsia="Arial" w:cs="Arial"/>
+              <w:rFonts w:eastAsia="Arial" w:cs="Arial"/>
               <w:color w:val="AAAAAA"/>
               <w:sz w:val="16"/>
               <w:szCs w:val="16"/>
@@ -1141,7 +1152,7 @@
   </w:tbl>
   <w:p>
     <w:pPr>
-      <w:spacing w:before="0" w:after="0"/>
+      <w:spacing w:after="0"/>
     </w:pPr>
   </w:p>
 </w:ftr>

</xml_diff>